<commit_message>
correction bug affichage explication question 26
</commit_message>
<xml_diff>
--- a/static/docs/Quiz/quiz 2 Formation Hygiène Alimentaire (pnd).docx
+++ b/static/docs/Quiz/quiz 2 Formation Hygiène Alimentaire (pnd).docx
@@ -150,9 +150,14 @@
       <w:r>
         <w:t xml:space="preserve">Le principe de prévention et le "porteur sain" : Le but fondamental de ces visites est de garantir qu'aucune personne atteinte d’une maladie susceptible d’être transmise par les aliments, ou présentant des lésions pouvant contaminer les </w:t>
       </w:r>
+      <w:proofErr w:type="gramStart"/>
       <w:r>
         <w:lastRenderedPageBreak/>
-        <w:t>produits carnés, ne soit autorisée à manipuler les denrées ou à entrer dans les zones de travail. Un "porteur sain" est une personne qui porte un agent infectieux sans développer de symptômes, ce qui représente un danger invisible pour la sécurité alimentaire. La visite médicale aide à repérer ce risque.</w:t>
+        <w:t>produits</w:t>
+      </w:r>
+      <w:proofErr w:type="gramEnd"/>
+      <w:r>
+        <w:t xml:space="preserve"> carnés, ne soit autorisée à manipuler les denrées ou à entrer dans les zones de travail. Un "porteur sain" est une personne qui porte un agent infectieux sans développer de symptômes, ce qui représente un danger invisible pour la sécurité alimentaire. La visite médicale aide à repérer ce risque.</w:t>
       </w:r>
     </w:p>
     <w:p>
@@ -919,8 +924,17 @@
           <w:b/>
           <w:bCs/>
         </w:rPr>
-        <w:t>Dans le Cercle de Sinner (TACT), que signifie la lettre 'C' ?</w:t>
-      </w:r>
+        <w:t>Dans le Cercle de Sinner (TACT), que signifie la lettre '</w:t>
+      </w:r>
+      <w:proofErr w:type="gramStart"/>
+      <w:r>
+        <w:rPr>
+          <w:b/>
+          <w:bCs/>
+        </w:rPr>
+        <w:t>C' ?</w:t>
+      </w:r>
+      <w:proofErr w:type="gramEnd"/>
     </w:p>
     <w:p>
       <w:r>
@@ -965,8 +979,13 @@
     </w:p>
     <w:p>
       <w:r>
-        <w:t>Dans le Cercle de Sinner (TACT), que signifie la lettre 'C' ?</w:t>
-      </w:r>
+        <w:t>Dans le Cercle de Sinner (TACT), que signifie la lettre '</w:t>
+      </w:r>
+      <w:proofErr w:type="gramStart"/>
+      <w:r>
+        <w:t>C' ?</w:t>
+      </w:r>
+      <w:proofErr w:type="gramEnd"/>
     </w:p>
     <w:p>
       <w:r>
@@ -1530,7 +1549,15 @@
     </w:p>
     <w:p>
       <w:r>
-        <w:t>Une inspection visuelle hebdomadaire est requise, mais le remplacement systématique matériel est beaucoup moins fréquent. Changer les plaques toutes les semaines constituerait un gaspillage injustifié de consommables.</w:t>
+        <w:t xml:space="preserve">Une inspection visuelle hebdomadaire est requise, mais le remplacement systématique matériel est beaucoup moins fréquent. Changer les plaques toutes les semaines </w:t>
+      </w:r>
+      <w:proofErr w:type="gramStart"/>
+      <w:r>
+        <w:t>constituerait</w:t>
+      </w:r>
+      <w:proofErr w:type="gramEnd"/>
+      <w:r>
+        <w:t xml:space="preserve"> un gaspillage injustifié de consommables.</w:t>
       </w:r>
     </w:p>
     <w:p>
@@ -2104,7 +2131,15 @@
         </w:numPr>
       </w:pPr>
       <w:r>
-        <w:t>T pour Température : La chaleur de l'eau permet d'activer les agents chimiques et de décoller les graisses (ex: 20 à 50°C pour le KING FLASH GERM).</w:t>
+        <w:t>T pour Température : La chaleur de l'eau permet d'activer les agents chimiques et de décoller les graisses (</w:t>
+      </w:r>
+      <w:proofErr w:type="gramStart"/>
+      <w:r>
+        <w:t>ex:</w:t>
+      </w:r>
+      <w:proofErr w:type="gramEnd"/>
+      <w:r>
+        <w:t xml:space="preserve"> 20 à 50°C pour le KING FLASH GERM).</w:t>
       </w:r>
     </w:p>
     <w:p>
@@ -2126,7 +2161,15 @@
         </w:numPr>
       </w:pPr>
       <w:r>
-        <w:t>C pour Concentration : Le dosage précis du produit chimique à diluer (ex: 1 %).</w:t>
+        <w:t>C pour Concentration : Le dosage précis du produit chimique à diluer (</w:t>
+      </w:r>
+      <w:proofErr w:type="gramStart"/>
+      <w:r>
+        <w:t>ex:</w:t>
+      </w:r>
+      <w:proofErr w:type="gramEnd"/>
+      <w:r>
+        <w:t xml:space="preserve"> 1 %).</w:t>
       </w:r>
     </w:p>
     <w:p>
@@ -2137,7 +2180,15 @@
         </w:numPr>
       </w:pPr>
       <w:r>
-        <w:t>T pour Temps d'action : La durée pendant laquelle le produit doit agir seul pour détruire les bactéries (ex: 5 minutes).</w:t>
+        <w:t>T pour Temps d'action : La durée pendant laquelle le produit doit agir seul pour détruire les bactéries (</w:t>
+      </w:r>
+      <w:proofErr w:type="gramStart"/>
+      <w:r>
+        <w:t>ex:</w:t>
+      </w:r>
+      <w:proofErr w:type="gramEnd"/>
+      <w:r>
+        <w:t xml:space="preserve"> 5 minutes).</w:t>
       </w:r>
     </w:p>
     <w:p>
@@ -2637,7 +2688,15 @@
         </w:numPr>
       </w:pPr>
       <w:r>
-        <w:t>Ergonomie : Tenir un chiffon en boule oblige à serrer les doigts en permanence. Le pliage à plat permet d'éviter de crisper inutilement la main et limite les tensions musculo-squelettiques du bras.</w:t>
+        <w:t xml:space="preserve">Ergonomie : Tenir un chiffon en boule oblige à serrer les doigts en permanence. Le pliage à plat permet d'éviter de crisper inutilement la main et limite les tensions </w:t>
+      </w:r>
+      <w:proofErr w:type="spellStart"/>
+      <w:r>
+        <w:t>musculo-squelettiques</w:t>
+      </w:r>
+      <w:proofErr w:type="spellEnd"/>
+      <w:r>
+        <w:t xml:space="preserve"> du bras.</w:t>
       </w:r>
     </w:p>
     <w:p>
@@ -3321,7 +3380,15 @@
         </w:numPr>
       </w:pPr>
       <w:r>
-        <w:t>Pourquoi ce temps est-il incompressible ? Ces 5 minutes correspondent au délai chimiquement nécessaire pour que le désinfectant tue les bactéries. Si vous rincez trop tôt (ex: au bout de 2 minutes), l'agent pathogène n'est pas détruit, l'équilibre du cercle est rompu, et la désinfection échoue.</w:t>
+        <w:t>Pourquoi ce temps est-il incompressible ? Ces 5 minutes correspondent au délai chimiquement nécessaire pour que le désinfectant tue les bactéries. Si vous rincez trop tôt (</w:t>
+      </w:r>
+      <w:proofErr w:type="gramStart"/>
+      <w:r>
+        <w:t>ex:</w:t>
+      </w:r>
+      <w:proofErr w:type="gramEnd"/>
+      <w:r>
+        <w:t xml:space="preserve"> au bout de 2 minutes), l'agent pathogène n'est pas détruit, l'équilibre du cercle est rompu, et la désinfection échoue.</w:t>
       </w:r>
     </w:p>
     <w:p>
@@ -3800,7 +3867,17 @@
     <w:p/>
     <w:p>
       <w:r>
-        <w:t>C. Pour éliminer les accumulations de sciure d'os et de moelle putrescibles (Bonne réponse)</w:t>
+        <w:t>C. Pour éliminer les accumulations de sciure d'os et de moelle putrescibles (</w:t>
+      </w:r>
+      <w:r>
+        <w:rPr>
+          <w:b/>
+          <w:bCs/>
+        </w:rPr>
+        <w:t>Bonne réponse</w:t>
+      </w:r>
+      <w:r>
+        <w:t>)</w:t>
       </w:r>
     </w:p>
     <w:p>
@@ -3827,7 +3904,15 @@
     </w:p>
     <w:p>
       <w:r>
-        <w:t xml:space="preserve">La scie à os génère une fine sciure composée de micro-fragments d'os, de moelle et de viande crue. Ces résidus se logent systématiquement dans les interstices des racleurs, </w:t>
+        <w:t xml:space="preserve">La scie à os génère une fine sciure composée de </w:t>
+      </w:r>
+      <w:proofErr w:type="spellStart"/>
+      <w:r>
+        <w:t>micro-fragments</w:t>
+      </w:r>
+      <w:proofErr w:type="spellEnd"/>
+      <w:r>
+        <w:t xml:space="preserve"> d'os, de moelle et de viande crue. Ces résidus se logent systématiquement dans les interstices des racleurs, </w:t>
       </w:r>
       <w:r>
         <w:lastRenderedPageBreak/>
@@ -3903,7 +3988,17 @@
     <w:p/>
     <w:p>
       <w:r>
-        <w:t>B. En chambre froide positive (0°C à +3°C) (Bonne réponse)</w:t>
+        <w:t xml:space="preserve">B. En chambre froide positive (0°C à +3°C) </w:t>
+      </w:r>
+      <w:r>
+        <w:rPr>
+          <w:b/>
+          <w:bCs/>
+        </w:rPr>
+        <w:t>(Bonne réponse</w:t>
+      </w:r>
+      <w:r>
+        <w:t>)</w:t>
       </w:r>
     </w:p>
     <w:p>
@@ -4026,7 +4121,17 @@
     <w:p/>
     <w:p>
       <w:r>
-        <w:t>C. L'espace situé derrière le protège-lame et le chariot coulissant (Bonne réponse)</w:t>
+        <w:t>C. L'espace situé derrière le protège-lame et le chariot coulissant (</w:t>
+      </w:r>
+      <w:r>
+        <w:rPr>
+          <w:b/>
+          <w:bCs/>
+        </w:rPr>
+        <w:t>Bonne réponse</w:t>
+      </w:r>
+      <w:r>
+        <w:t>)</w:t>
       </w:r>
     </w:p>
     <w:p>
@@ -4098,7 +4203,15 @@
     </w:p>
     <w:p>
       <w:r>
-        <w:t>A. Les viandes avariées présentant un danger biologique grave pour la santé humaine B. Les os, gras et parures sains non destinés à la consommation humaine pour des raisons commerciales C. Les déchets d'emballages en plastique ayant été en contact direct avec la viande fraîche D. Les produits de nettoyage chimiques utilisés pour la désinfection du laboratoire de découpe</w:t>
+        <w:t xml:space="preserve">A. Les viandes avariées présentant un danger biologique grave pour la santé humaine B. Les os, gras et </w:t>
+      </w:r>
+      <w:proofErr w:type="gramStart"/>
+      <w:r>
+        <w:t>parures sains</w:t>
+      </w:r>
+      <w:proofErr w:type="gramEnd"/>
+      <w:r>
+        <w:t xml:space="preserve"> non destinés à la consommation humaine pour des raisons commerciales C. Les déchets d'emballages en plastique ayant été en contact direct avec la viande fraîche D. Les produits de nettoyage chimiques utilisés pour la désinfection du laboratoire de découpe</w:t>
       </w:r>
     </w:p>
     <w:p>
@@ -4132,7 +4245,15 @@
     </w:p>
     <w:p>
       <w:r>
-        <w:t xml:space="preserve">B. Les os, gras et parures sains non destinés à la consommation humaine pour des raisons commerciales </w:t>
+        <w:t xml:space="preserve">B. Les os, gras et </w:t>
+      </w:r>
+      <w:proofErr w:type="gramStart"/>
+      <w:r>
+        <w:t>parures sains</w:t>
+      </w:r>
+      <w:proofErr w:type="gramEnd"/>
+      <w:r>
+        <w:t xml:space="preserve"> non destinés à la consommation humaine pour des raisons commerciales </w:t>
       </w:r>
       <w:r>
         <w:rPr>
@@ -4142,7 +4263,15 @@
         <w:t>(Bonne réponse)</w:t>
       </w:r>
       <w:r>
-        <w:t xml:space="preserve"> Cette classification officielle regroupe exclusivement les parties d'animaux sains qui sont écartées du circuit commercial pour des raisons esthétiques ou techniques. Elle inclut typiquement les os de découpe, les excès de gras et les aponévroses générés quotidiennement par l'artisan boucher.</w:t>
+        <w:t xml:space="preserve"> Cette classification officielle regroupe exclusivement les parties d'animaux sains qui sont écartées du circuit commercial pour des raisons esthétiques ou techniques. Elle inclut typiquement les os de découpe, les excès de gras et </w:t>
+      </w:r>
+      <w:proofErr w:type="gramStart"/>
+      <w:r>
+        <w:t>les aponévroses générés</w:t>
+      </w:r>
+      <w:proofErr w:type="gramEnd"/>
+      <w:r>
+        <w:t xml:space="preserve"> quotidiennement par l'artisan boucher.</w:t>
       </w:r>
     </w:p>
     <w:p>
@@ -4434,7 +4563,22 @@
     </w:p>
     <w:p>
       <w:r>
-        <w:t>A. Tous les déchets peuvent être jetés ensemble puis triés à la fin du service de la journée B. Le tri doit être effectué strictement à la source avec un bac exclusivement dédié aux seuls SPA3 C. Les SPA3 doivent être mélangés avec le carton pour absorber l'humidité du sang et des jus D. Il suffit de placer les SPA3 dans des sacs poubelles noirs classiques transparents posés au sol</w:t>
+        <w:t>A. Tous les déchets peuvent être jetés ensemble puis triés à la fin du service de la journée</w:t>
+      </w:r>
+    </w:p>
+    <w:p>
+      <w:r>
+        <w:t xml:space="preserve"> B. Le tri doit être effectué strictement à la source avec un bac exclusivement dédié aux seuls SPA3</w:t>
+      </w:r>
+    </w:p>
+    <w:p>
+      <w:r>
+        <w:t xml:space="preserve"> C. Les SPA3 doivent être mélangés avec le carton pour absorber l'humidité du sang et des jus </w:t>
+      </w:r>
+    </w:p>
+    <w:p>
+      <w:r>
+        <w:t>D. Il suffit de placer les SPA3 dans des sacs poubelles noirs classiques transparents posés au sol</w:t>
       </w:r>
     </w:p>
     <w:p>
@@ -4483,16 +4627,16 @@
     </w:p>
     <w:p>
       <w:r>
-        <w:t>C. Les SPA3 doivent être mélangés avec le carton pour absorber l'humidité du sang et des jus Les emballages en carton souillés par le sang ou la graisse animale deviennent immédiatement impossibles à revaloriser par les filières classiques. Cette association désastreuse annule simultanément et irrémédiablement les lourds protocoles d'équarrissage et de recyclage des papiers.</w:t>
-      </w:r>
-    </w:p>
-    <w:p>
-      <w:r>
-        <w:t xml:space="preserve">D. Il suffit de placer les SPA3 dans des sacs poubelles noirs classiques transparents posés au sol Les fins sacs en plastique classiques sont fragiles et se percent très </w:t>
+        <w:t xml:space="preserve">C. Les SPA3 doivent être mélangés avec le carton pour absorber l'humidité du sang et des jus Les emballages en carton souillés par le sang ou la graisse animale deviennent immédiatement impossibles à revaloriser par les filières classiques. Cette association </w:t>
       </w:r>
       <w:r>
         <w:lastRenderedPageBreak/>
-        <w:t>facilement sous les arêtes particulièrement pointues des os découpés. L'écoulement silencieux d'exsudats sanguinolents directement sur le carrelage de l'atelier créerait une très dangereuse zone hautement contaminée.</w:t>
+        <w:t>désastreuse annule simultanément et irrémédiablement les lourds protocoles d'équarrissage et de recyclage des papiers.</w:t>
+      </w:r>
+    </w:p>
+    <w:p>
+      <w:r>
+        <w:t>D. Il suffit de placer les SPA3 dans des sacs poubelles noirs classiques transparents posés au sol Les fins sacs en plastique classiques sont fragiles et se percent très facilement sous les arêtes particulièrement pointues des os découpés. L'écoulement silencieux d'exsudats sanguinolents directement sur le carrelage de l'atelier créerait une très dangereuse zone hautement contaminée.</w:t>
       </w:r>
     </w:p>
     <w:p>
@@ -4596,12 +4740,12 @@
     </w:p>
     <w:p>
       <w:r>
+        <w:lastRenderedPageBreak/>
         <w:t>C. Une attestation sur l'honneur signée par l'ensemble des employés du laboratoire de découpe Une simple déclaration interne purement manuscrite n'a strictement aucune valeur juridique probante face aux lourdes exigences de l'administration vétérinaire européenne. Seule l'attestation formelle validée par un prestataire de transport certifié permet de fermer officiellement la boucle de traçabilité.</w:t>
       </w:r>
     </w:p>
     <w:p>
       <w:r>
-        <w:lastRenderedPageBreak/>
         <w:t>D. Le certificat de garantie du fabricant du bac en plastique utilisé pour le stockage Ce modeste document technique industriel atteste exclusivement de la robustesse mécanique ou de l'étanchéité du matériel de stockage acheté. Il ne fournit logiquement aucune indication factuelle sur le tonnage ou sur la bonne gestion du flux des déchets par l'artisan.</w:t>
       </w:r>
     </w:p>
@@ -4709,8 +4853,13 @@
         </w:numPr>
       </w:pPr>
       <w:r>
-        <w:t>Gestion des dechets</w:t>
-      </w:r>
+        <w:t xml:space="preserve">Gestion des </w:t>
+      </w:r>
+      <w:proofErr w:type="spellStart"/>
+      <w:r>
+        <w:t>dechets</w:t>
+      </w:r>
+      <w:proofErr w:type="spellEnd"/>
     </w:p>
     <w:sectPr>
       <w:pgSz w:w="11906" w:h="16838"/>
@@ -10994,6 +11143,7 @@
   <w:style w:type="character" w:default="1" w:styleId="Policepardfaut">
     <w:name w:val="Default Paragraph Font"/>
     <w:uiPriority w:val="1"/>
+    <w:semiHidden/>
     <w:unhideWhenUsed/>
   </w:style>
   <w:style w:type="table" w:default="1" w:styleId="TableauNormal">

</xml_diff>